<commit_message>
Styled letterhead/quote docx + ?option= URL param on hub
Letterhead: header table (logo left, contact right), gold divider
rule under header, gold 'Re:' line, gold rule at top of footer with
brand tagline centered.

Quote: same header pattern with QUOTATION label in gold, styled
meta block, line-item table with gold header row and shaded total
row, footer tagline.

Hub: URL param ?option={id} pre-selects that logo in the LK
Branding Kit panel. Shareable link example:
lk-hub.html?tab=lk-branding&option=monogram

Co-Authored-By: Claude Opus 4.6 (1M context) <noreply@anthropic.com>
</commit_message>
<xml_diff>
--- a/assets/branding/options/aicustom/letterhead.docx
+++ b/assets/branding/options/aicustom/letterhead.docx
@@ -4,11 +4,11 @@
   <w:body>
     <w:p>
       <w:pPr>
-        <w:spacing w:before="960"/>
+        <w:spacing w:before="480"/>
       </w:pPr>
       <w:r>
         <w:rPr>
-          <w:color w:val="555555"/>
+          <w:color w:val="2B2B2B"/>
           <w:sz w:val="20"/>
         </w:rPr>
         <w:t>[Date]</w:t>
@@ -21,12 +21,22 @@
         </w:rPr>
         <w:t>[Recipient Name]</w:t>
         <w:br/>
-        <w:t>[Address Line 1]</w:t>
+        <w:t>[Company / Address Line 1]</w:t>
         <w:br/>
         <w:t>[Suburb, State Postcode]</w:t>
       </w:r>
     </w:p>
     <w:p/>
+    <w:p>
+      <w:r>
+        <w:rPr>
+          <w:b/>
+          <w:color w:val="8A722C"/>
+          <w:sz w:val="22"/>
+        </w:rPr>
+        <w:t>Re: [Subject Line]</w:t>
+      </w:r>
+    </w:p>
     <w:p>
       <w:r>
         <w:rPr>
@@ -40,7 +50,23 @@
         <w:rPr>
           <w:sz w:val="22"/>
         </w:rPr>
-        <w:t>Thank you for considering LK Design and Build for your project. [Body text — describe the project, scope, timeline, and next steps. Keep a warm, confident tone consistent with the brand.]</w:t>
+        <w:t>Thank you for considering LK Design and Build. We specialise in premium home renovations, additions and bespoke builds across Adelaide — combining considered design with precision construction.</w:t>
+      </w:r>
+    </w:p>
+    <w:p>
+      <w:r>
+        <w:rPr>
+          <w:sz w:val="22"/>
+        </w:rPr>
+        <w:t>[Continue your letter here. This template provides the branded letterhead with your selected logo and brand typography. Replace this paragraph with your message.]</w:t>
+      </w:r>
+    </w:p>
+    <w:p>
+      <w:r>
+        <w:rPr>
+          <w:sz w:val="22"/>
+        </w:rPr>
+        <w:t>We look forward to discussing your project in detail.</w:t>
       </w:r>
     </w:p>
     <w:p/>
@@ -64,7 +90,7 @@
     <w:p>
       <w:r>
         <w:rPr>
-          <w:color w:val="8A7A52"/>
+          <w:color w:val="8A722C"/>
           <w:sz w:val="18"/>
         </w:rPr>
         <w:t>LK Design and Build</w:t>
@@ -87,14 +113,32 @@
   <w:p>
     <w:pPr>
       <w:pStyle w:val="Footer"/>
+      <w:spacing w:before="120"/>
       <w:jc w:val="center"/>
+      <w:pBdr>
+        <w:top w:val="single" w:sz="8" w:space="4" w:color="8a722c"/>
+      </w:pBdr>
     </w:pPr>
     <w:r>
       <w:rPr>
-        <w:color w:val="8A7A52"/>
-        <w:sz w:val="16"/>
-      </w:rPr>
-      <w:t>Considered design.  Precision build.  ·  Option 5 — AI Custom Slab</w:t>
+        <w:b/>
+        <w:color w:val="8A722C"/>
+        <w:sz w:val="18"/>
+      </w:rPr>
+      <w:t>Considered design.  Precision build.</w:t>
+    </w:r>
+  </w:p>
+  <w:p>
+    <w:pPr>
+      <w:jc w:val="center"/>
+    </w:pPr>
+    <w:r>
+      <w:rPr>
+        <w:i/>
+        <w:color w:val="776B4F"/>
+        <w:sz w:val="14"/>
+      </w:rPr>
+      <w:t>Option 5 — AI Custom Slab</w:t>
     </w:r>
   </w:p>
 </w:ftr>
@@ -105,55 +149,121 @@
   <w:p>
     <w:pPr>
       <w:pStyle w:val="Header"/>
-      <w:jc w:val="left"/>
-    </w:pPr>
-    <w:r>
-      <w:drawing>
-        <wp:inline xmlns:a="http://schemas.openxmlformats.org/drawingml/2006/main" xmlns:pic="http://schemas.openxmlformats.org/drawingml/2006/picture">
-          <wp:extent cx="1224000" cy="840924"/>
-          <wp:docPr id="1" name="Picture 1"/>
-          <wp:cNvGraphicFramePr>
-            <a:graphicFrameLocks noChangeAspect="1"/>
-          </wp:cNvGraphicFramePr>
-          <a:graphic>
-            <a:graphicData uri="http://schemas.openxmlformats.org/drawingml/2006/picture">
-              <pic:pic>
-                <pic:nvPicPr>
-                  <pic:cNvPr id="0" name="lk_v3_custom_slab_transparent_black.png"/>
-                  <pic:cNvPicPr/>
-                </pic:nvPicPr>
-                <pic:blipFill>
-                  <a:blip r:embed="rId1"/>
-                  <a:stretch>
-                    <a:fillRect/>
-                  </a:stretch>
-                </pic:blipFill>
-                <pic:spPr>
-                  <a:xfrm>
-                    <a:off x="0" y="0"/>
-                    <a:ext cx="1224000" cy="840924"/>
-                  </a:xfrm>
-                  <a:prstGeom prst="rect"/>
-                </pic:spPr>
-              </pic:pic>
-            </a:graphicData>
-          </a:graphic>
-        </wp:inline>
-      </w:drawing>
-    </w:r>
+    </w:pPr>
   </w:p>
+  <w:tbl>
+    <w:tblPr>
+      <w:tblW w:type="auto" w:w="0"/>
+      <w:tblLayout w:type="fixed"/>
+      <w:tblLook w:firstColumn="1" w:firstRow="1" w:lastColumn="0" w:lastRow="0" w:noHBand="0" w:noVBand="1" w:val="04A0"/>
+    </w:tblPr>
+    <w:tblGrid>
+      <w:gridCol w:w="3402"/>
+      <w:gridCol w:w="6236"/>
+    </w:tblGrid>
+    <w:tr>
+      <w:tc>
+        <w:tcPr>
+          <w:tcW w:type="dxa" w:w="4819"/>
+          <w:tcBorders>
+            <w:top w:val="nil"/>
+            <w:bottom w:val="nil"/>
+            <w:left w:val="nil"/>
+            <w:right w:val="nil"/>
+          </w:tcBorders>
+        </w:tcPr>
+        <w:p>
+          <w:pPr>
+            <w:spacing w:after="0"/>
+          </w:pPr>
+          <w:r>
+            <w:drawing>
+              <wp:inline xmlns:a="http://schemas.openxmlformats.org/drawingml/2006/main" xmlns:pic="http://schemas.openxmlformats.org/drawingml/2006/picture">
+                <wp:extent cx="1728000" cy="1187187"/>
+                <wp:docPr id="1" name="Picture 1"/>
+                <wp:cNvGraphicFramePr>
+                  <a:graphicFrameLocks noChangeAspect="1"/>
+                </wp:cNvGraphicFramePr>
+                <a:graphic>
+                  <a:graphicData uri="http://schemas.openxmlformats.org/drawingml/2006/picture">
+                    <pic:pic>
+                      <pic:nvPicPr>
+                        <pic:cNvPr id="0" name="lk_v3_custom_slab_transparent_dark_alt.png"/>
+                        <pic:cNvPicPr/>
+                      </pic:nvPicPr>
+                      <pic:blipFill>
+                        <a:blip r:embed="rId1"/>
+                        <a:stretch>
+                          <a:fillRect/>
+                        </a:stretch>
+                      </pic:blipFill>
+                      <pic:spPr>
+                        <a:xfrm>
+                          <a:off x="0" y="0"/>
+                          <a:ext cx="1728000" cy="1187187"/>
+                        </a:xfrm>
+                        <a:prstGeom prst="rect"/>
+                      </pic:spPr>
+                    </pic:pic>
+                  </a:graphicData>
+                </a:graphic>
+              </wp:inline>
+            </w:drawing>
+          </w:r>
+        </w:p>
+      </w:tc>
+      <w:tc>
+        <w:tcPr>
+          <w:tcW w:type="dxa" w:w="4819"/>
+          <w:tcBorders>
+            <w:top w:val="nil"/>
+            <w:bottom w:val="nil"/>
+            <w:left w:val="nil"/>
+            <w:right w:val="nil"/>
+          </w:tcBorders>
+        </w:tcPr>
+        <w:p>
+          <w:pPr>
+            <w:spacing w:after="0"/>
+            <w:jc w:val="right"/>
+          </w:pPr>
+          <w:r>
+            <w:rPr>
+              <w:b/>
+              <w:color w:val="2B2B2B"/>
+              <w:sz w:val="20"/>
+            </w:rPr>
+            <w:t>LK Design and Build</w:t>
+            <w:br/>
+          </w:r>
+        </w:p>
+        <w:p>
+          <w:pPr>
+            <w:spacing w:after="0"/>
+            <w:jc w:val="right"/>
+          </w:pPr>
+          <w:r>
+            <w:rPr>
+              <w:color w:val="776B4F"/>
+              <w:sz w:val="18"/>
+            </w:rPr>
+            <w:t>hello@lkdesignandbuild.com.au</w:t>
+            <w:br/>
+            <w:t>0481 742 026</w:t>
+            <w:br/>
+            <w:t>Adelaide, South Australia</w:t>
+          </w:r>
+        </w:p>
+      </w:tc>
+    </w:tr>
+  </w:tbl>
   <w:p>
     <w:pPr>
-      <w:jc w:val="right"/>
-    </w:pPr>
-    <w:r>
-      <w:rPr>
-        <w:rFonts w:ascii="Calibri" w:hAnsi="Calibri"/>
-        <w:color w:val="6A5E42"/>
-        <w:sz w:val="18"/>
-      </w:rPr>
-      <w:t>hello@lkdesignandbuild.com.au  ·  0481 742 026  ·  Adelaide, SA</w:t>
-    </w:r>
+      <w:spacing w:before="160" w:after="0"/>
+      <w:pBdr>
+        <w:bottom w:val="single" w:sz="12" w:space="4" w:color="8a722c"/>
+      </w:pBdr>
+    </w:pPr>
   </w:p>
 </w:hdr>
 </file>

</xml_diff>

<commit_message>
Rebuild letterhead/quote docx to match original Blueprint template
Followed the original Blueprint letterhead structure:
- Large centered logo inline at the top (~55mm wide)
- Horizontal gold #C9A96E rule beneath
- Centered contact line (phone | email | website | Adelaide)
- Body content
- Closing gold rule with ABN/footer line

Quote template follows the same header, plus:
- Gold QUOTATION banner
- 2-column borderless table for Quote # / Client details
- Scope of works heading in gold
- Line-item table with gold-filled header row and cream-shaded total row
- Closing gold rule + brand tagline

Co-Authored-By: Claude Opus 4.6 (1M context) <noreply@anthropic.com>
</commit_message>
<xml_diff>
--- a/assets/branding/options/aicustom/letterhead.docx
+++ b/assets/branding/options/aicustom/letterhead.docx
@@ -4,11 +4,76 @@
   <w:body>
     <w:p>
       <w:pPr>
-        <w:spacing w:before="480"/>
+        <w:spacing w:after="80"/>
+        <w:jc w:val="center"/>
+      </w:pPr>
+      <w:r>
+        <w:drawing>
+          <wp:inline xmlns:a="http://schemas.openxmlformats.org/drawingml/2006/main" xmlns:pic="http://schemas.openxmlformats.org/drawingml/2006/picture">
+            <wp:extent cx="1980000" cy="1360318"/>
+            <wp:docPr id="1" name="Picture 1"/>
+            <wp:cNvGraphicFramePr>
+              <a:graphicFrameLocks noChangeAspect="1"/>
+            </wp:cNvGraphicFramePr>
+            <a:graphic>
+              <a:graphicData uri="http://schemas.openxmlformats.org/drawingml/2006/picture">
+                <pic:pic>
+                  <pic:nvPicPr>
+                    <pic:cNvPr id="0" name="lk_v3_custom_slab_transparent_dark_alt.png"/>
+                    <pic:cNvPicPr/>
+                  </pic:nvPicPr>
+                  <pic:blipFill>
+                    <a:blip r:embed="rId9"/>
+                    <a:stretch>
+                      <a:fillRect/>
+                    </a:stretch>
+                  </pic:blipFill>
+                  <pic:spPr>
+                    <a:xfrm>
+                      <a:off x="0" y="0"/>
+                      <a:ext cx="1980000" cy="1360318"/>
+                    </a:xfrm>
+                    <a:prstGeom prst="rect"/>
+                  </pic:spPr>
+                </pic:pic>
+              </a:graphicData>
+            </a:graphic>
+          </wp:inline>
+        </w:drawing>
+      </w:r>
+    </w:p>
+    <w:p>
+      <w:pPr>
+        <w:spacing w:before="40" w:after="40"/>
+        <w:pBdr>
+          <w:bottom w:val="single" w:sz="6" w:space="1" w:color="C9A96E"/>
+        </w:pBdr>
+      </w:pPr>
+    </w:p>
+    <w:p>
+      <w:pPr>
+        <w:spacing w:after="80"/>
+        <w:jc w:val="center"/>
       </w:pPr>
       <w:r>
         <w:rPr>
-          <w:color w:val="2B2B2B"/>
+          <w:rFonts w:ascii="Calibri" w:hAnsi="Calibri"/>
+          <w:b w:val="0"/>
+          <w:i w:val="0"/>
+          <w:color w:val="666666"/>
+          <w:sz w:val="16"/>
+        </w:rPr>
+        <w:t>0481 742 026  |  hello@lkdesignandbuild.com.au  |  www.lkdesignandbuild.com.au  |  Adelaide, South Australia</w:t>
+      </w:r>
+    </w:p>
+    <w:p/>
+    <w:p>
+      <w:r>
+        <w:rPr>
+          <w:rFonts w:ascii="Calibri" w:hAnsi="Calibri"/>
+          <w:b w:val="0"/>
+          <w:i w:val="0"/>
+          <w:color w:val="2C2C2C"/>
           <w:sz w:val="20"/>
         </w:rPr>
         <w:t>[Date]</w:t>
@@ -17,22 +82,30 @@
     <w:p>
       <w:r>
         <w:rPr>
+          <w:rFonts w:ascii="Calibri" w:hAnsi="Calibri"/>
+          <w:b w:val="0"/>
+          <w:i w:val="0"/>
+          <w:color w:val="2C2C2C"/>
           <w:sz w:val="20"/>
         </w:rPr>
         <w:t>[Recipient Name]</w:t>
         <w:br/>
         <w:t>[Company / Address Line 1]</w:t>
         <w:br/>
-        <w:t>[Suburb, State Postcode]</w:t>
+        <w:t>[Address Line 2]</w:t>
+        <w:br/>
+        <w:t>[City, State, Postcode]</w:t>
       </w:r>
     </w:p>
     <w:p/>
     <w:p>
       <w:r>
         <w:rPr>
+          <w:rFonts w:ascii="Calibri" w:hAnsi="Calibri"/>
           <w:b/>
-          <w:color w:val="8A722C"/>
-          <w:sz w:val="22"/>
+          <w:i w:val="0"/>
+          <w:color w:val="2C2C2C"/>
+          <w:sz w:val="20"/>
         </w:rPr>
         <w:t>Re: [Subject Line]</w:t>
       </w:r>
@@ -40,7 +113,11 @@
     <w:p>
       <w:r>
         <w:rPr>
-          <w:sz w:val="22"/>
+          <w:rFonts w:ascii="Calibri" w:hAnsi="Calibri"/>
+          <w:b w:val="0"/>
+          <w:i w:val="0"/>
+          <w:color w:val="2C2C2C"/>
+          <w:sz w:val="20"/>
         </w:rPr>
         <w:t>Dear [Name],</w:t>
       </w:r>
@@ -48,23 +125,35 @@
     <w:p>
       <w:r>
         <w:rPr>
-          <w:sz w:val="22"/>
+          <w:rFonts w:ascii="Calibri" w:hAnsi="Calibri"/>
+          <w:b w:val="0"/>
+          <w:i w:val="0"/>
+          <w:color w:val="2C2C2C"/>
+          <w:sz w:val="20"/>
         </w:rPr>
-        <w:t>Thank you for considering LK Design and Build. We specialise in premium home renovations, additions and bespoke builds across Adelaide — combining considered design with precision construction.</w:t>
+        <w:t>Thank you for your interest in LK Design and Build. We specialise in premium home renovations, additions, and new builds across Adelaide, delivering exceptional craftsmanship and thoughtful design at every stage.</w:t>
       </w:r>
     </w:p>
     <w:p>
       <w:r>
         <w:rPr>
-          <w:sz w:val="22"/>
+          <w:rFonts w:ascii="Calibri" w:hAnsi="Calibri"/>
+          <w:b w:val="0"/>
+          <w:i w:val="0"/>
+          <w:color w:val="2C2C2C"/>
+          <w:sz w:val="20"/>
         </w:rPr>
-        <w:t>[Continue your letter here. This template provides the branded letterhead with your selected logo and brand typography. Replace this paragraph with your message.]</w:t>
+        <w:t>[Continue your letter here. This template provides the branded letterhead with your selected logo. Simply replace the placeholder text with your content.]</w:t>
       </w:r>
     </w:p>
     <w:p>
       <w:r>
         <w:rPr>
-          <w:sz w:val="22"/>
+          <w:rFonts w:ascii="Calibri" w:hAnsi="Calibri"/>
+          <w:b w:val="0"/>
+          <w:i w:val="0"/>
+          <w:color w:val="2C2C2C"/>
+          <w:sz w:val="20"/>
         </w:rPr>
         <w:t>We look forward to discussing your project in detail.</w:t>
       </w:r>
@@ -73,16 +162,25 @@
     <w:p>
       <w:r>
         <w:rPr>
-          <w:sz w:val="22"/>
+          <w:rFonts w:ascii="Calibri" w:hAnsi="Calibri"/>
+          <w:b w:val="0"/>
+          <w:i w:val="0"/>
+          <w:color w:val="2C2C2C"/>
+          <w:sz w:val="20"/>
         </w:rPr>
         <w:t>Kind regards,</w:t>
       </w:r>
     </w:p>
+    <w:p/>
+    <w:p/>
     <w:p>
       <w:r>
         <w:rPr>
+          <w:rFonts w:ascii="Calibri" w:hAnsi="Calibri"/>
           <w:b/>
-          <w:sz w:val="22"/>
+          <w:i w:val="0"/>
+          <w:color w:val="2C2C2C"/>
+          <w:sz w:val="20"/>
         </w:rPr>
         <w:t>Lyda</w:t>
       </w:r>
@@ -90,182 +188,47 @@
     <w:p>
       <w:r>
         <w:rPr>
-          <w:color w:val="8A722C"/>
+          <w:rFonts w:ascii="Calibri" w:hAnsi="Calibri"/>
+          <w:b w:val="0"/>
+          <w:i w:val="0"/>
+          <w:color w:val="C9A96E"/>
           <w:sz w:val="18"/>
         </w:rPr>
         <w:t>LK Design and Build</w:t>
       </w:r>
     </w:p>
+    <w:p>
+      <w:pPr>
+        <w:spacing w:before="40" w:after="40"/>
+        <w:pBdr>
+          <w:bottom w:val="single" w:sz="6" w:space="1" w:color="C9A96E"/>
+        </w:pBdr>
+      </w:pPr>
+    </w:p>
+    <w:p>
+      <w:pPr>
+        <w:spacing w:after="80"/>
+        <w:jc w:val="center"/>
+      </w:pPr>
+      <w:r>
+        <w:rPr>
+          <w:rFonts w:ascii="Calibri" w:hAnsi="Calibri"/>
+          <w:b w:val="0"/>
+          <w:i/>
+          <w:color w:val="666666"/>
+          <w:sz w:val="14"/>
+        </w:rPr>
+        <w:t>LK Design and Build  |  Adelaide, South Australia  |  Option 5 — AI Custom Slab</w:t>
+      </w:r>
+    </w:p>
     <w:sectPr>
-      <w:headerReference w:type="default" r:id="rId9"/>
-      <w:footerReference w:type="default" r:id="rId10"/>
       <w:pgSz w:w="12240" w:h="15840"/>
-      <w:pgMar w:top="1134" w:right="1361" w:bottom="1247" w:left="1361" w:header="720" w:footer="720" w:gutter="0"/>
+      <w:pgMar w:top="1134" w:right="1417" w:bottom="1134" w:left="1417" w:header="720" w:footer="720" w:gutter="0"/>
       <w:cols w:space="720"/>
       <w:docGrid w:linePitch="360"/>
     </w:sectPr>
   </w:body>
 </w:document>
-</file>
-
-<file path=word/footer1.xml><?xml version="1.0" encoding="utf-8"?>
-<w:ftr xmlns:m="http://schemas.openxmlformats.org/officeDocument/2006/math" xmlns:mc="http://schemas.openxmlformats.org/markup-compatibility/2006" xmlns:mo="http://schemas.microsoft.com/office/mac/office/2008/main" xmlns:mv="urn:schemas-microsoft-com:mac:vml" xmlns:o="urn:schemas-microsoft-com:office:office" xmlns:r="http://schemas.openxmlformats.org/officeDocument/2006/relationships" xmlns:v="urn:schemas-microsoft-com:vml" xmlns:w10="urn:schemas-microsoft-com:office:word" xmlns:w14="http://schemas.microsoft.com/office/word/2010/wordml" xmlns:w="http://schemas.openxmlformats.org/wordprocessingml/2006/main" xmlns:wne="http://schemas.microsoft.com/office/word/2006/wordml" xmlns:wp14="http://schemas.microsoft.com/office/word/2010/wordprocessingDrawing" xmlns:wp="http://schemas.openxmlformats.org/drawingml/2006/wordprocessingDrawing" xmlns:wpc="http://schemas.microsoft.com/office/word/2010/wordprocessingCanvas" xmlns:wpg="http://schemas.microsoft.com/office/word/2010/wordprocessingGroup" xmlns:wpi="http://schemas.microsoft.com/office/word/2010/wordprocessingInk" xmlns:wps="http://schemas.microsoft.com/office/word/2010/wordprocessingShape" mc:Ignorable="w14 wp14">
-  <w:p>
-    <w:pPr>
-      <w:pStyle w:val="Footer"/>
-      <w:spacing w:before="120"/>
-      <w:jc w:val="center"/>
-      <w:pBdr>
-        <w:top w:val="single" w:sz="8" w:space="4" w:color="8a722c"/>
-      </w:pBdr>
-    </w:pPr>
-    <w:r>
-      <w:rPr>
-        <w:b/>
-        <w:color w:val="8A722C"/>
-        <w:sz w:val="18"/>
-      </w:rPr>
-      <w:t>Considered design.  Precision build.</w:t>
-    </w:r>
-  </w:p>
-  <w:p>
-    <w:pPr>
-      <w:jc w:val="center"/>
-    </w:pPr>
-    <w:r>
-      <w:rPr>
-        <w:i/>
-        <w:color w:val="776B4F"/>
-        <w:sz w:val="14"/>
-      </w:rPr>
-      <w:t>Option 5 — AI Custom Slab</w:t>
-    </w:r>
-  </w:p>
-</w:ftr>
-</file>
-
-<file path=word/header1.xml><?xml version="1.0" encoding="utf-8"?>
-<w:hdr xmlns:m="http://schemas.openxmlformats.org/officeDocument/2006/math" xmlns:mc="http://schemas.openxmlformats.org/markup-compatibility/2006" xmlns:mo="http://schemas.microsoft.com/office/mac/office/2008/main" xmlns:mv="urn:schemas-microsoft-com:mac:vml" xmlns:o="urn:schemas-microsoft-com:office:office" xmlns:r="http://schemas.openxmlformats.org/officeDocument/2006/relationships" xmlns:v="urn:schemas-microsoft-com:vml" xmlns:w10="urn:schemas-microsoft-com:office:word" xmlns:w14="http://schemas.microsoft.com/office/word/2010/wordml" xmlns:w="http://schemas.openxmlformats.org/wordprocessingml/2006/main" xmlns:wne="http://schemas.microsoft.com/office/word/2006/wordml" xmlns:wp14="http://schemas.microsoft.com/office/word/2010/wordprocessingDrawing" xmlns:wp="http://schemas.openxmlformats.org/drawingml/2006/wordprocessingDrawing" xmlns:wpc="http://schemas.microsoft.com/office/word/2010/wordprocessingCanvas" xmlns:wpg="http://schemas.microsoft.com/office/word/2010/wordprocessingGroup" xmlns:wpi="http://schemas.microsoft.com/office/word/2010/wordprocessingInk" xmlns:wps="http://schemas.microsoft.com/office/word/2010/wordprocessingShape" mc:Ignorable="w14 wp14">
-  <w:p>
-    <w:pPr>
-      <w:pStyle w:val="Header"/>
-    </w:pPr>
-  </w:p>
-  <w:tbl>
-    <w:tblPr>
-      <w:tblW w:type="auto" w:w="0"/>
-      <w:tblLayout w:type="fixed"/>
-      <w:tblLook w:firstColumn="1" w:firstRow="1" w:lastColumn="0" w:lastRow="0" w:noHBand="0" w:noVBand="1" w:val="04A0"/>
-    </w:tblPr>
-    <w:tblGrid>
-      <w:gridCol w:w="3402"/>
-      <w:gridCol w:w="6236"/>
-    </w:tblGrid>
-    <w:tr>
-      <w:tc>
-        <w:tcPr>
-          <w:tcW w:type="dxa" w:w="4819"/>
-          <w:tcBorders>
-            <w:top w:val="nil"/>
-            <w:bottom w:val="nil"/>
-            <w:left w:val="nil"/>
-            <w:right w:val="nil"/>
-          </w:tcBorders>
-        </w:tcPr>
-        <w:p>
-          <w:pPr>
-            <w:spacing w:after="0"/>
-          </w:pPr>
-          <w:r>
-            <w:drawing>
-              <wp:inline xmlns:a="http://schemas.openxmlformats.org/drawingml/2006/main" xmlns:pic="http://schemas.openxmlformats.org/drawingml/2006/picture">
-                <wp:extent cx="1728000" cy="1187187"/>
-                <wp:docPr id="1" name="Picture 1"/>
-                <wp:cNvGraphicFramePr>
-                  <a:graphicFrameLocks noChangeAspect="1"/>
-                </wp:cNvGraphicFramePr>
-                <a:graphic>
-                  <a:graphicData uri="http://schemas.openxmlformats.org/drawingml/2006/picture">
-                    <pic:pic>
-                      <pic:nvPicPr>
-                        <pic:cNvPr id="0" name="lk_v3_custom_slab_transparent_dark_alt.png"/>
-                        <pic:cNvPicPr/>
-                      </pic:nvPicPr>
-                      <pic:blipFill>
-                        <a:blip r:embed="rId1"/>
-                        <a:stretch>
-                          <a:fillRect/>
-                        </a:stretch>
-                      </pic:blipFill>
-                      <pic:spPr>
-                        <a:xfrm>
-                          <a:off x="0" y="0"/>
-                          <a:ext cx="1728000" cy="1187187"/>
-                        </a:xfrm>
-                        <a:prstGeom prst="rect"/>
-                      </pic:spPr>
-                    </pic:pic>
-                  </a:graphicData>
-                </a:graphic>
-              </wp:inline>
-            </w:drawing>
-          </w:r>
-        </w:p>
-      </w:tc>
-      <w:tc>
-        <w:tcPr>
-          <w:tcW w:type="dxa" w:w="4819"/>
-          <w:tcBorders>
-            <w:top w:val="nil"/>
-            <w:bottom w:val="nil"/>
-            <w:left w:val="nil"/>
-            <w:right w:val="nil"/>
-          </w:tcBorders>
-        </w:tcPr>
-        <w:p>
-          <w:pPr>
-            <w:spacing w:after="0"/>
-            <w:jc w:val="right"/>
-          </w:pPr>
-          <w:r>
-            <w:rPr>
-              <w:b/>
-              <w:color w:val="2B2B2B"/>
-              <w:sz w:val="20"/>
-            </w:rPr>
-            <w:t>LK Design and Build</w:t>
-            <w:br/>
-          </w:r>
-        </w:p>
-        <w:p>
-          <w:pPr>
-            <w:spacing w:after="0"/>
-            <w:jc w:val="right"/>
-          </w:pPr>
-          <w:r>
-            <w:rPr>
-              <w:color w:val="776B4F"/>
-              <w:sz w:val="18"/>
-            </w:rPr>
-            <w:t>hello@lkdesignandbuild.com.au</w:t>
-            <w:br/>
-            <w:t>0481 742 026</w:t>
-            <w:br/>
-            <w:t>Adelaide, South Australia</w:t>
-          </w:r>
-        </w:p>
-      </w:tc>
-    </w:tr>
-  </w:tbl>
-  <w:p>
-    <w:pPr>
-      <w:spacing w:before="160" w:after="0"/>
-      <w:pBdr>
-        <w:bottom w:val="single" w:sz="12" w:space="4" w:color="8a722c"/>
-      </w:pBdr>
-    </w:pPr>
-  </w:p>
-</w:hdr>
 </file>
 
 <file path=word/numbering.xml><?xml version="1.0" encoding="utf-8"?>

</xml_diff>

<commit_message>
Left-align letterhead/quote logo block; add tagline below PNG logos without one
Co-Authored-By: Claude Opus 4.6 (1M context) <noreply@anthropic.com>
</commit_message>
<xml_diff>
--- a/assets/branding/options/aicustom/letterhead.docx
+++ b/assets/branding/options/aicustom/letterhead.docx
@@ -4,13 +4,13 @@
   <w:body>
     <w:p>
       <w:pPr>
-        <w:spacing w:after="80"/>
-        <w:jc w:val="center"/>
+        <w:spacing w:after="40"/>
+        <w:jc w:val="left"/>
       </w:pPr>
       <w:r>
         <w:drawing>
           <wp:inline xmlns:a="http://schemas.openxmlformats.org/drawingml/2006/main" xmlns:pic="http://schemas.openxmlformats.org/drawingml/2006/picture">
-            <wp:extent cx="1980000" cy="1360318"/>
+            <wp:extent cx="1512000" cy="1038788"/>
             <wp:docPr id="1" name="Picture 1"/>
             <wp:cNvGraphicFramePr>
               <a:graphicFrameLocks noChangeAspect="1"/>
@@ -31,7 +31,7 @@
                   <pic:spPr>
                     <a:xfrm>
                       <a:off x="0" y="0"/>
-                      <a:ext cx="1980000" cy="1360318"/>
+                      <a:ext cx="1512000" cy="1038788"/>
                     </a:xfrm>
                     <a:prstGeom prst="rect"/>
                   </pic:spPr>
@@ -44,7 +44,7 @@
     </w:p>
     <w:p>
       <w:pPr>
-        <w:spacing w:before="40" w:after="40"/>
+        <w:spacing w:before="80" w:after="40"/>
         <w:pBdr>
           <w:bottom w:val="single" w:sz="6" w:space="1" w:color="C9A96E"/>
         </w:pBdr>
@@ -199,7 +199,7 @@
     </w:p>
     <w:p>
       <w:pPr>
-        <w:spacing w:before="40" w:after="40"/>
+        <w:spacing w:before="80" w:after="40"/>
         <w:pBdr>
           <w:bottom w:val="single" w:sz="6" w:space="1" w:color="C9A96E"/>
         </w:pBdr>

</xml_diff>

<commit_message>
Size logos in docx by height — uniform ~18mm visual height across all options
Co-Authored-By: Claude Opus 4.6 (1M context) <noreply@anthropic.com>
</commit_message>
<xml_diff>
--- a/assets/branding/options/aicustom/letterhead.docx
+++ b/assets/branding/options/aicustom/letterhead.docx
@@ -10,7 +10,7 @@
       <w:r>
         <w:drawing>
           <wp:inline xmlns:a="http://schemas.openxmlformats.org/drawingml/2006/main" xmlns:pic="http://schemas.openxmlformats.org/drawingml/2006/picture">
-            <wp:extent cx="1512000" cy="1038788"/>
+            <wp:extent cx="1047990" cy="720000"/>
             <wp:docPr id="1" name="Picture 1"/>
             <wp:cNvGraphicFramePr>
               <a:graphicFrameLocks noChangeAspect="1"/>
@@ -31,7 +31,7 @@
                   <pic:spPr>
                     <a:xfrm>
                       <a:off x="0" y="0"/>
-                      <a:ext cx="1512000" cy="1038788"/>
+                      <a:ext cx="1047990" cy="720000"/>
                     </a:xfrm>
                     <a:prstGeom prst="rect"/>
                   </pic:spPr>

</xml_diff>